<commit_message>
Enhance tenant portal with calendar features and UI improvements
- Added `CompanyCalendarPage` for calendar management and integrated routing.
- Updated catalog components to include `CatalogLayout`, `CatalogItemsPage`, and `CatalogPacksPage`.
- Refactored document management routes to utilize `DocumentsLayout` for better organization.
- Introduced new utility functions for calendar date handling and event grouping.
- Enhanced user interface with new components and improved responsiveness.
- Added tests for calendar date utilities to ensure functionality and reliability.
</commit_message>
<xml_diff>
--- a/tmp/docx-seed/commercial/delivery-generic-ca.docx
+++ b/tmp/docx-seed/commercial/delivery-generic-ca.docx
@@ -668,7 +668,18 @@
         <w:t xml:space="preserve">[[tax_rate]]</w:t>
       </w:r>
       <w:r>
-        <w:t xml:space="preserve">%: </w:t>
+        <w:t xml:space="preserve">% </w:t>
+      </w:r>
+      <w:r>
+        <w:rPr>
+          <w:b/>
+          <w:bCs/>
+          <w:color w:val="1D4ED8"/>
+        </w:rPr>
+        <w:t xml:space="preserve">[[tax_base]]</w:t>
+      </w:r>
+      <w:r>
+        <w:t xml:space="preserve">: </w:t>
       </w:r>
       <w:r>
         <w:rPr>

</xml_diff>